<commit_message>
Section VII: 47 images individuelles (enveloppes spectrales) avec toutes sourdines cuivres+cordes, TDM 140 entrées
</commit_message>
<xml_diff>
--- a/Versions-html-and-docx/section_enveloppes_v5.docx
+++ b/Versions-html-and-docx/section_enveloppes_v5.docx
@@ -10,23 +10,12 @@
         <w:rPr>
           <w:color w:val="1A237E"/>
         </w:rPr>
-        <w:t>VII. Enveloppes spectrales par famille</w:t>
+        <w:t>VII. Enveloppes spectrales par instrument</w:t>
       </w:r>
     </w:p>
     <w:p>
-      <w:pPr>
-        <w:pStyle w:val="ListBullet"/>
-      </w:pPr>
       <w:r>
-        <w:t>Enveloppes spectrales moyennes calculées à partir des données specenv brutes.</w:t>
-      </w:r>
-    </w:p>
-    <w:p>
-      <w:pPr>
-        <w:pStyle w:val="ListBullet"/>
-      </w:pPr>
-      <w:r>
-        <w:t>Marqueurs rouges : F1–F4 ; ligne verte : Fp ; bande : ±1σ.</w:t>
+        <w:t>Enveloppes spectrales moyennes (ordinario). Marqueurs F1-F4, Fp centroïde, bande ±1σ. Inclut toutes les sourdines.</w:t>
       </w:r>
     </w:p>
     <w:p>
@@ -38,13 +27,11 @@
       </w:r>
     </w:p>
     <w:p>
+      <w:pPr>
+        <w:pStyle w:val="Heading2"/>
+      </w:pPr>
       <w:r>
-        <w:t>Les bois montrent la plus grande diversité de profils d'enveloppe, du piccolo à la flûte contrebasse.</w:t>
-      </w:r>
-    </w:p>
-    <w:p>
-      <w:r>
-        <w:t>Instruments chargés : 13 / 13 — Échantillons : 1265</w:t>
+        <w:t>Piccolo</w:t>
       </w:r>
     </w:p>
     <w:p>
@@ -54,7 +41,7 @@
       <w:r>
         <w:drawing>
           <wp:inline xmlns:a="http://schemas.openxmlformats.org/drawingml/2006/main" xmlns:pic="http://schemas.openxmlformats.org/drawingml/2006/picture">
-            <wp:extent cx="6217920" cy="15191874"/>
+            <wp:extent cx="5486400" cy="2361235"/>
             <wp:docPr id="1" name="Picture 1"/>
             <wp:cNvGraphicFramePr>
               <a:graphicFrameLocks noChangeAspect="1"/>
@@ -63,7 +50,7 @@
               <a:graphicData uri="http://schemas.openxmlformats.org/drawingml/2006/picture">
                 <pic:pic>
                   <pic:nvPicPr>
-                    <pic:cNvPr id="0" name="enveloppes_bois.png"/>
+                    <pic:cNvPr id="0" name="specenv_piccolo.png"/>
                     <pic:cNvPicPr/>
                   </pic:nvPicPr>
                   <pic:blipFill>
@@ -75,7 +62,571 @@
                   <pic:spPr>
                     <a:xfrm>
                       <a:off x="0" y="0"/>
-                      <a:ext cx="6217920" cy="15191874"/>
+                      <a:ext cx="5486400" cy="2361235"/>
+                    </a:xfrm>
+                    <a:prstGeom prst="rect"/>
+                  </pic:spPr>
+                </pic:pic>
+              </a:graphicData>
+            </a:graphic>
+          </wp:inline>
+        </w:drawing>
+      </w:r>
+    </w:p>
+    <w:p>
+      <w:pPr>
+        <w:pStyle w:val="Heading2"/>
+      </w:pPr>
+      <w:r>
+        <w:t>Flûte</w:t>
+      </w:r>
+    </w:p>
+    <w:p>
+      <w:pPr>
+        <w:jc w:val="center"/>
+      </w:pPr>
+      <w:r>
+        <w:drawing>
+          <wp:inline xmlns:a="http://schemas.openxmlformats.org/drawingml/2006/main" xmlns:pic="http://schemas.openxmlformats.org/drawingml/2006/picture">
+            <wp:extent cx="5486400" cy="2361235"/>
+            <wp:docPr id="2" name="Picture 2"/>
+            <wp:cNvGraphicFramePr>
+              <a:graphicFrameLocks noChangeAspect="1"/>
+            </wp:cNvGraphicFramePr>
+            <a:graphic>
+              <a:graphicData uri="http://schemas.openxmlformats.org/drawingml/2006/picture">
+                <pic:pic>
+                  <pic:nvPicPr>
+                    <pic:cNvPr id="0" name="specenv_flute.png"/>
+                    <pic:cNvPicPr/>
+                  </pic:nvPicPr>
+                  <pic:blipFill>
+                    <a:blip r:embed="rId10"/>
+                    <a:stretch>
+                      <a:fillRect/>
+                    </a:stretch>
+                  </pic:blipFill>
+                  <pic:spPr>
+                    <a:xfrm>
+                      <a:off x="0" y="0"/>
+                      <a:ext cx="5486400" cy="2361235"/>
+                    </a:xfrm>
+                    <a:prstGeom prst="rect"/>
+                  </pic:spPr>
+                </pic:pic>
+              </a:graphicData>
+            </a:graphic>
+          </wp:inline>
+        </w:drawing>
+      </w:r>
+    </w:p>
+    <w:p>
+      <w:pPr>
+        <w:pStyle w:val="Heading2"/>
+      </w:pPr>
+      <w:r>
+        <w:t>Flûte basse</w:t>
+      </w:r>
+    </w:p>
+    <w:p>
+      <w:pPr>
+        <w:jc w:val="center"/>
+      </w:pPr>
+      <w:r>
+        <w:drawing>
+          <wp:inline xmlns:a="http://schemas.openxmlformats.org/drawingml/2006/main" xmlns:pic="http://schemas.openxmlformats.org/drawingml/2006/picture">
+            <wp:extent cx="5486400" cy="2361235"/>
+            <wp:docPr id="3" name="Picture 3"/>
+            <wp:cNvGraphicFramePr>
+              <a:graphicFrameLocks noChangeAspect="1"/>
+            </wp:cNvGraphicFramePr>
+            <a:graphic>
+              <a:graphicData uri="http://schemas.openxmlformats.org/drawingml/2006/picture">
+                <pic:pic>
+                  <pic:nvPicPr>
+                    <pic:cNvPr id="0" name="specenv_flute_basse.png"/>
+                    <pic:cNvPicPr/>
+                  </pic:nvPicPr>
+                  <pic:blipFill>
+                    <a:blip r:embed="rId11"/>
+                    <a:stretch>
+                      <a:fillRect/>
+                    </a:stretch>
+                  </pic:blipFill>
+                  <pic:spPr>
+                    <a:xfrm>
+                      <a:off x="0" y="0"/>
+                      <a:ext cx="5486400" cy="2361235"/>
+                    </a:xfrm>
+                    <a:prstGeom prst="rect"/>
+                  </pic:spPr>
+                </pic:pic>
+              </a:graphicData>
+            </a:graphic>
+          </wp:inline>
+        </w:drawing>
+      </w:r>
+    </w:p>
+    <w:p>
+      <w:pPr>
+        <w:pStyle w:val="Heading2"/>
+      </w:pPr>
+      <w:r>
+        <w:t>Flûte contrebasse</w:t>
+      </w:r>
+    </w:p>
+    <w:p>
+      <w:pPr>
+        <w:jc w:val="center"/>
+      </w:pPr>
+      <w:r>
+        <w:drawing>
+          <wp:inline xmlns:a="http://schemas.openxmlformats.org/drawingml/2006/main" xmlns:pic="http://schemas.openxmlformats.org/drawingml/2006/picture">
+            <wp:extent cx="5486400" cy="2361235"/>
+            <wp:docPr id="4" name="Picture 4"/>
+            <wp:cNvGraphicFramePr>
+              <a:graphicFrameLocks noChangeAspect="1"/>
+            </wp:cNvGraphicFramePr>
+            <a:graphic>
+              <a:graphicData uri="http://schemas.openxmlformats.org/drawingml/2006/picture">
+                <pic:pic>
+                  <pic:nvPicPr>
+                    <pic:cNvPr id="0" name="specenv_flute_contrebasse.png"/>
+                    <pic:cNvPicPr/>
+                  </pic:nvPicPr>
+                  <pic:blipFill>
+                    <a:blip r:embed="rId12"/>
+                    <a:stretch>
+                      <a:fillRect/>
+                    </a:stretch>
+                  </pic:blipFill>
+                  <pic:spPr>
+                    <a:xfrm>
+                      <a:off x="0" y="0"/>
+                      <a:ext cx="5486400" cy="2361235"/>
+                    </a:xfrm>
+                    <a:prstGeom prst="rect"/>
+                  </pic:spPr>
+                </pic:pic>
+              </a:graphicData>
+            </a:graphic>
+          </wp:inline>
+        </w:drawing>
+      </w:r>
+    </w:p>
+    <w:p>
+      <w:pPr>
+        <w:pStyle w:val="Heading2"/>
+      </w:pPr>
+      <w:r>
+        <w:t>Hautbois</w:t>
+      </w:r>
+    </w:p>
+    <w:p>
+      <w:pPr>
+        <w:jc w:val="center"/>
+      </w:pPr>
+      <w:r>
+        <w:drawing>
+          <wp:inline xmlns:a="http://schemas.openxmlformats.org/drawingml/2006/main" xmlns:pic="http://schemas.openxmlformats.org/drawingml/2006/picture">
+            <wp:extent cx="5486400" cy="2361235"/>
+            <wp:docPr id="5" name="Picture 5"/>
+            <wp:cNvGraphicFramePr>
+              <a:graphicFrameLocks noChangeAspect="1"/>
+            </wp:cNvGraphicFramePr>
+            <a:graphic>
+              <a:graphicData uri="http://schemas.openxmlformats.org/drawingml/2006/picture">
+                <pic:pic>
+                  <pic:nvPicPr>
+                    <pic:cNvPr id="0" name="specenv_hautbois.png"/>
+                    <pic:cNvPicPr/>
+                  </pic:nvPicPr>
+                  <pic:blipFill>
+                    <a:blip r:embed="rId13"/>
+                    <a:stretch>
+                      <a:fillRect/>
+                    </a:stretch>
+                  </pic:blipFill>
+                  <pic:spPr>
+                    <a:xfrm>
+                      <a:off x="0" y="0"/>
+                      <a:ext cx="5486400" cy="2361235"/>
+                    </a:xfrm>
+                    <a:prstGeom prst="rect"/>
+                  </pic:spPr>
+                </pic:pic>
+              </a:graphicData>
+            </a:graphic>
+          </wp:inline>
+        </w:drawing>
+      </w:r>
+    </w:p>
+    <w:p>
+      <w:pPr>
+        <w:pStyle w:val="Heading2"/>
+      </w:pPr>
+      <w:r>
+        <w:t>Cor anglais</w:t>
+      </w:r>
+    </w:p>
+    <w:p>
+      <w:pPr>
+        <w:jc w:val="center"/>
+      </w:pPr>
+      <w:r>
+        <w:drawing>
+          <wp:inline xmlns:a="http://schemas.openxmlformats.org/drawingml/2006/main" xmlns:pic="http://schemas.openxmlformats.org/drawingml/2006/picture">
+            <wp:extent cx="5486400" cy="2361235"/>
+            <wp:docPr id="6" name="Picture 6"/>
+            <wp:cNvGraphicFramePr>
+              <a:graphicFrameLocks noChangeAspect="1"/>
+            </wp:cNvGraphicFramePr>
+            <a:graphic>
+              <a:graphicData uri="http://schemas.openxmlformats.org/drawingml/2006/picture">
+                <pic:pic>
+                  <pic:nvPicPr>
+                    <pic:cNvPr id="0" name="specenv_cor_anglais.png"/>
+                    <pic:cNvPicPr/>
+                  </pic:nvPicPr>
+                  <pic:blipFill>
+                    <a:blip r:embed="rId14"/>
+                    <a:stretch>
+                      <a:fillRect/>
+                    </a:stretch>
+                  </pic:blipFill>
+                  <pic:spPr>
+                    <a:xfrm>
+                      <a:off x="0" y="0"/>
+                      <a:ext cx="5486400" cy="2361235"/>
+                    </a:xfrm>
+                    <a:prstGeom prst="rect"/>
+                  </pic:spPr>
+                </pic:pic>
+              </a:graphicData>
+            </a:graphic>
+          </wp:inline>
+        </w:drawing>
+      </w:r>
+    </w:p>
+    <w:p>
+      <w:pPr>
+        <w:pStyle w:val="Heading2"/>
+      </w:pPr>
+      <w:r>
+        <w:t>Clarinette en Mib</w:t>
+      </w:r>
+    </w:p>
+    <w:p>
+      <w:pPr>
+        <w:jc w:val="center"/>
+      </w:pPr>
+      <w:r>
+        <w:drawing>
+          <wp:inline xmlns:a="http://schemas.openxmlformats.org/drawingml/2006/main" xmlns:pic="http://schemas.openxmlformats.org/drawingml/2006/picture">
+            <wp:extent cx="5486400" cy="2361235"/>
+            <wp:docPr id="7" name="Picture 7"/>
+            <wp:cNvGraphicFramePr>
+              <a:graphicFrameLocks noChangeAspect="1"/>
+            </wp:cNvGraphicFramePr>
+            <a:graphic>
+              <a:graphicData uri="http://schemas.openxmlformats.org/drawingml/2006/picture">
+                <pic:pic>
+                  <pic:nvPicPr>
+                    <pic:cNvPr id="0" name="specenv_clarinette_en_mib.png"/>
+                    <pic:cNvPicPr/>
+                  </pic:nvPicPr>
+                  <pic:blipFill>
+                    <a:blip r:embed="rId15"/>
+                    <a:stretch>
+                      <a:fillRect/>
+                    </a:stretch>
+                  </pic:blipFill>
+                  <pic:spPr>
+                    <a:xfrm>
+                      <a:off x="0" y="0"/>
+                      <a:ext cx="5486400" cy="2361235"/>
+                    </a:xfrm>
+                    <a:prstGeom prst="rect"/>
+                  </pic:spPr>
+                </pic:pic>
+              </a:graphicData>
+            </a:graphic>
+          </wp:inline>
+        </w:drawing>
+      </w:r>
+    </w:p>
+    <w:p>
+      <w:pPr>
+        <w:pStyle w:val="Heading2"/>
+      </w:pPr>
+      <w:r>
+        <w:t>Clarinette en Sib</w:t>
+      </w:r>
+    </w:p>
+    <w:p>
+      <w:pPr>
+        <w:jc w:val="center"/>
+      </w:pPr>
+      <w:r>
+        <w:drawing>
+          <wp:inline xmlns:a="http://schemas.openxmlformats.org/drawingml/2006/main" xmlns:pic="http://schemas.openxmlformats.org/drawingml/2006/picture">
+            <wp:extent cx="5486400" cy="2361235"/>
+            <wp:docPr id="8" name="Picture 8"/>
+            <wp:cNvGraphicFramePr>
+              <a:graphicFrameLocks noChangeAspect="1"/>
+            </wp:cNvGraphicFramePr>
+            <a:graphic>
+              <a:graphicData uri="http://schemas.openxmlformats.org/drawingml/2006/picture">
+                <pic:pic>
+                  <pic:nvPicPr>
+                    <pic:cNvPr id="0" name="specenv_clarinette_en_sib.png"/>
+                    <pic:cNvPicPr/>
+                  </pic:nvPicPr>
+                  <pic:blipFill>
+                    <a:blip r:embed="rId16"/>
+                    <a:stretch>
+                      <a:fillRect/>
+                    </a:stretch>
+                  </pic:blipFill>
+                  <pic:spPr>
+                    <a:xfrm>
+                      <a:off x="0" y="0"/>
+                      <a:ext cx="5486400" cy="2361235"/>
+                    </a:xfrm>
+                    <a:prstGeom prst="rect"/>
+                  </pic:spPr>
+                </pic:pic>
+              </a:graphicData>
+            </a:graphic>
+          </wp:inline>
+        </w:drawing>
+      </w:r>
+    </w:p>
+    <w:p>
+      <w:pPr>
+        <w:pStyle w:val="Heading2"/>
+      </w:pPr>
+      <w:r>
+        <w:t>Clarinette basse</w:t>
+      </w:r>
+    </w:p>
+    <w:p>
+      <w:pPr>
+        <w:jc w:val="center"/>
+      </w:pPr>
+      <w:r>
+        <w:drawing>
+          <wp:inline xmlns:a="http://schemas.openxmlformats.org/drawingml/2006/main" xmlns:pic="http://schemas.openxmlformats.org/drawingml/2006/picture">
+            <wp:extent cx="5486400" cy="2361235"/>
+            <wp:docPr id="9" name="Picture 9"/>
+            <wp:cNvGraphicFramePr>
+              <a:graphicFrameLocks noChangeAspect="1"/>
+            </wp:cNvGraphicFramePr>
+            <a:graphic>
+              <a:graphicData uri="http://schemas.openxmlformats.org/drawingml/2006/picture">
+                <pic:pic>
+                  <pic:nvPicPr>
+                    <pic:cNvPr id="0" name="specenv_clarinette_basse.png"/>
+                    <pic:cNvPicPr/>
+                  </pic:nvPicPr>
+                  <pic:blipFill>
+                    <a:blip r:embed="rId17"/>
+                    <a:stretch>
+                      <a:fillRect/>
+                    </a:stretch>
+                  </pic:blipFill>
+                  <pic:spPr>
+                    <a:xfrm>
+                      <a:off x="0" y="0"/>
+                      <a:ext cx="5486400" cy="2361235"/>
+                    </a:xfrm>
+                    <a:prstGeom prst="rect"/>
+                  </pic:spPr>
+                </pic:pic>
+              </a:graphicData>
+            </a:graphic>
+          </wp:inline>
+        </w:drawing>
+      </w:r>
+    </w:p>
+    <w:p>
+      <w:pPr>
+        <w:pStyle w:val="Heading2"/>
+      </w:pPr>
+      <w:r>
+        <w:t>Clarinette contrebasse</w:t>
+      </w:r>
+    </w:p>
+    <w:p>
+      <w:pPr>
+        <w:jc w:val="center"/>
+      </w:pPr>
+      <w:r>
+        <w:drawing>
+          <wp:inline xmlns:a="http://schemas.openxmlformats.org/drawingml/2006/main" xmlns:pic="http://schemas.openxmlformats.org/drawingml/2006/picture">
+            <wp:extent cx="5486400" cy="2361235"/>
+            <wp:docPr id="10" name="Picture 10"/>
+            <wp:cNvGraphicFramePr>
+              <a:graphicFrameLocks noChangeAspect="1"/>
+            </wp:cNvGraphicFramePr>
+            <a:graphic>
+              <a:graphicData uri="http://schemas.openxmlformats.org/drawingml/2006/picture">
+                <pic:pic>
+                  <pic:nvPicPr>
+                    <pic:cNvPr id="0" name="specenv_clarinette_contrebasse.png"/>
+                    <pic:cNvPicPr/>
+                  </pic:nvPicPr>
+                  <pic:blipFill>
+                    <a:blip r:embed="rId18"/>
+                    <a:stretch>
+                      <a:fillRect/>
+                    </a:stretch>
+                  </pic:blipFill>
+                  <pic:spPr>
+                    <a:xfrm>
+                      <a:off x="0" y="0"/>
+                      <a:ext cx="5486400" cy="2361235"/>
+                    </a:xfrm>
+                    <a:prstGeom prst="rect"/>
+                  </pic:spPr>
+                </pic:pic>
+              </a:graphicData>
+            </a:graphic>
+          </wp:inline>
+        </w:drawing>
+      </w:r>
+    </w:p>
+    <w:p>
+      <w:pPr>
+        <w:pStyle w:val="Heading2"/>
+      </w:pPr>
+      <w:r>
+        <w:t>Basson</w:t>
+      </w:r>
+    </w:p>
+    <w:p>
+      <w:pPr>
+        <w:jc w:val="center"/>
+      </w:pPr>
+      <w:r>
+        <w:drawing>
+          <wp:inline xmlns:a="http://schemas.openxmlformats.org/drawingml/2006/main" xmlns:pic="http://schemas.openxmlformats.org/drawingml/2006/picture">
+            <wp:extent cx="5486400" cy="2361235"/>
+            <wp:docPr id="11" name="Picture 11"/>
+            <wp:cNvGraphicFramePr>
+              <a:graphicFrameLocks noChangeAspect="1"/>
+            </wp:cNvGraphicFramePr>
+            <a:graphic>
+              <a:graphicData uri="http://schemas.openxmlformats.org/drawingml/2006/picture">
+                <pic:pic>
+                  <pic:nvPicPr>
+                    <pic:cNvPr id="0" name="specenv_basson.png"/>
+                    <pic:cNvPicPr/>
+                  </pic:nvPicPr>
+                  <pic:blipFill>
+                    <a:blip r:embed="rId19"/>
+                    <a:stretch>
+                      <a:fillRect/>
+                    </a:stretch>
+                  </pic:blipFill>
+                  <pic:spPr>
+                    <a:xfrm>
+                      <a:off x="0" y="0"/>
+                      <a:ext cx="5486400" cy="2361235"/>
+                    </a:xfrm>
+                    <a:prstGeom prst="rect"/>
+                  </pic:spPr>
+                </pic:pic>
+              </a:graphicData>
+            </a:graphic>
+          </wp:inline>
+        </w:drawing>
+      </w:r>
+    </w:p>
+    <w:p>
+      <w:pPr>
+        <w:pStyle w:val="Heading2"/>
+      </w:pPr>
+      <w:r>
+        <w:t>Contrebasson</w:t>
+      </w:r>
+    </w:p>
+    <w:p>
+      <w:pPr>
+        <w:jc w:val="center"/>
+      </w:pPr>
+      <w:r>
+        <w:drawing>
+          <wp:inline xmlns:a="http://schemas.openxmlformats.org/drawingml/2006/main" xmlns:pic="http://schemas.openxmlformats.org/drawingml/2006/picture">
+            <wp:extent cx="5486400" cy="2361235"/>
+            <wp:docPr id="12" name="Picture 12"/>
+            <wp:cNvGraphicFramePr>
+              <a:graphicFrameLocks noChangeAspect="1"/>
+            </wp:cNvGraphicFramePr>
+            <a:graphic>
+              <a:graphicData uri="http://schemas.openxmlformats.org/drawingml/2006/picture">
+                <pic:pic>
+                  <pic:nvPicPr>
+                    <pic:cNvPr id="0" name="specenv_contrebasson.png"/>
+                    <pic:cNvPicPr/>
+                  </pic:nvPicPr>
+                  <pic:blipFill>
+                    <a:blip r:embed="rId20"/>
+                    <a:stretch>
+                      <a:fillRect/>
+                    </a:stretch>
+                  </pic:blipFill>
+                  <pic:spPr>
+                    <a:xfrm>
+                      <a:off x="0" y="0"/>
+                      <a:ext cx="5486400" cy="2361235"/>
+                    </a:xfrm>
+                    <a:prstGeom prst="rect"/>
+                  </pic:spPr>
+                </pic:pic>
+              </a:graphicData>
+            </a:graphic>
+          </wp:inline>
+        </w:drawing>
+      </w:r>
+    </w:p>
+    <w:p>
+      <w:pPr>
+        <w:pStyle w:val="Heading2"/>
+      </w:pPr>
+      <w:r>
+        <w:t>Saxophone alto</w:t>
+      </w:r>
+    </w:p>
+    <w:p>
+      <w:pPr>
+        <w:jc w:val="center"/>
+      </w:pPr>
+      <w:r>
+        <w:drawing>
+          <wp:inline xmlns:a="http://schemas.openxmlformats.org/drawingml/2006/main" xmlns:pic="http://schemas.openxmlformats.org/drawingml/2006/picture">
+            <wp:extent cx="5486400" cy="2361235"/>
+            <wp:docPr id="13" name="Picture 13"/>
+            <wp:cNvGraphicFramePr>
+              <a:graphicFrameLocks noChangeAspect="1"/>
+            </wp:cNvGraphicFramePr>
+            <a:graphic>
+              <a:graphicData uri="http://schemas.openxmlformats.org/drawingml/2006/picture">
+                <pic:pic>
+                  <pic:nvPicPr>
+                    <pic:cNvPr id="0" name="specenv_saxophone_alto.png"/>
+                    <pic:cNvPicPr/>
+                  </pic:nvPicPr>
+                  <pic:blipFill>
+                    <a:blip r:embed="rId21"/>
+                    <a:stretch>
+                      <a:fillRect/>
+                    </a:stretch>
+                  </pic:blipFill>
+                  <pic:spPr>
+                    <a:xfrm>
+                      <a:off x="0" y="0"/>
+                      <a:ext cx="5486400" cy="2361235"/>
                     </a:xfrm>
                     <a:prstGeom prst="rect"/>
                   </pic:spPr>
@@ -95,13 +646,11 @@
       </w:r>
     </w:p>
     <w:p>
+      <w:pPr>
+        <w:pStyle w:val="Heading2"/>
+      </w:pPr>
       <w:r>
-        <w:t>Les cuivres présentent des enveloppes plus concentrées, avec des zones d'énergie très lisibles dans le medium.</w:t>
-      </w:r>
-    </w:p>
-    <w:p>
-      <w:r>
-        <w:t>Instruments chargés : 6 / 6 — Échantillons : 754</w:t>
+        <w:t>Cor en Fa</w:t>
       </w:r>
     </w:p>
     <w:p>
@@ -111,8 +660,8 @@
       <w:r>
         <w:drawing>
           <wp:inline xmlns:a="http://schemas.openxmlformats.org/drawingml/2006/main" xmlns:pic="http://schemas.openxmlformats.org/drawingml/2006/picture">
-            <wp:extent cx="6217920" cy="6529137"/>
-            <wp:docPr id="2" name="Picture 2"/>
+            <wp:extent cx="5486400" cy="2361235"/>
+            <wp:docPr id="14" name="Picture 14"/>
             <wp:cNvGraphicFramePr>
               <a:graphicFrameLocks noChangeAspect="1"/>
             </wp:cNvGraphicFramePr>
@@ -120,11 +669,11 @@
               <a:graphicData uri="http://schemas.openxmlformats.org/drawingml/2006/picture">
                 <pic:pic>
                   <pic:nvPicPr>
-                    <pic:cNvPr id="0" name="enveloppes_cuivres.png"/>
+                    <pic:cNvPr id="0" name="specenv_cor_en_fa.png"/>
                     <pic:cNvPicPr/>
                   </pic:nvPicPr>
                   <pic:blipFill>
-                    <a:blip r:embed="rId10"/>
+                    <a:blip r:embed="rId22"/>
                     <a:stretch>
                       <a:fillRect/>
                     </a:stretch>
@@ -132,7 +681,712 @@
                   <pic:spPr>
                     <a:xfrm>
                       <a:off x="0" y="0"/>
-                      <a:ext cx="6217920" cy="6529137"/>
+                      <a:ext cx="5486400" cy="2361235"/>
+                    </a:xfrm>
+                    <a:prstGeom prst="rect"/>
+                  </pic:spPr>
+                </pic:pic>
+              </a:graphicData>
+            </a:graphic>
+          </wp:inline>
+        </w:drawing>
+      </w:r>
+    </w:p>
+    <w:p>
+      <w:pPr>
+        <w:pStyle w:val="Heading2"/>
+      </w:pPr>
+      <w:r>
+        <w:t>Cor+sourdine</w:t>
+      </w:r>
+    </w:p>
+    <w:p>
+      <w:pPr>
+        <w:jc w:val="center"/>
+      </w:pPr>
+      <w:r>
+        <w:drawing>
+          <wp:inline xmlns:a="http://schemas.openxmlformats.org/drawingml/2006/main" xmlns:pic="http://schemas.openxmlformats.org/drawingml/2006/picture">
+            <wp:extent cx="5486400" cy="2361235"/>
+            <wp:docPr id="15" name="Picture 15"/>
+            <wp:cNvGraphicFramePr>
+              <a:graphicFrameLocks noChangeAspect="1"/>
+            </wp:cNvGraphicFramePr>
+            <a:graphic>
+              <a:graphicData uri="http://schemas.openxmlformats.org/drawingml/2006/picture">
+                <pic:pic>
+                  <pic:nvPicPr>
+                    <pic:cNvPr id="0" name="specenv_cor_sourdine.png"/>
+                    <pic:cNvPicPr/>
+                  </pic:nvPicPr>
+                  <pic:blipFill>
+                    <a:blip r:embed="rId23"/>
+                    <a:stretch>
+                      <a:fillRect/>
+                    </a:stretch>
+                  </pic:blipFill>
+                  <pic:spPr>
+                    <a:xfrm>
+                      <a:off x="0" y="0"/>
+                      <a:ext cx="5486400" cy="2361235"/>
+                    </a:xfrm>
+                    <a:prstGeom prst="rect"/>
+                  </pic:spPr>
+                </pic:pic>
+              </a:graphicData>
+            </a:graphic>
+          </wp:inline>
+        </w:drawing>
+      </w:r>
+    </w:p>
+    <w:p>
+      <w:pPr>
+        <w:pStyle w:val="Heading2"/>
+      </w:pPr>
+      <w:r>
+        <w:t>Trompette en Ut</w:t>
+      </w:r>
+    </w:p>
+    <w:p>
+      <w:pPr>
+        <w:jc w:val="center"/>
+      </w:pPr>
+      <w:r>
+        <w:drawing>
+          <wp:inline xmlns:a="http://schemas.openxmlformats.org/drawingml/2006/main" xmlns:pic="http://schemas.openxmlformats.org/drawingml/2006/picture">
+            <wp:extent cx="5486400" cy="2361235"/>
+            <wp:docPr id="16" name="Picture 16"/>
+            <wp:cNvGraphicFramePr>
+              <a:graphicFrameLocks noChangeAspect="1"/>
+            </wp:cNvGraphicFramePr>
+            <a:graphic>
+              <a:graphicData uri="http://schemas.openxmlformats.org/drawingml/2006/picture">
+                <pic:pic>
+                  <pic:nvPicPr>
+                    <pic:cNvPr id="0" name="specenv_trompette_en_ut.png"/>
+                    <pic:cNvPicPr/>
+                  </pic:nvPicPr>
+                  <pic:blipFill>
+                    <a:blip r:embed="rId24"/>
+                    <a:stretch>
+                      <a:fillRect/>
+                    </a:stretch>
+                  </pic:blipFill>
+                  <pic:spPr>
+                    <a:xfrm>
+                      <a:off x="0" y="0"/>
+                      <a:ext cx="5486400" cy="2361235"/>
+                    </a:xfrm>
+                    <a:prstGeom prst="rect"/>
+                  </pic:spPr>
+                </pic:pic>
+              </a:graphicData>
+            </a:graphic>
+          </wp:inline>
+        </w:drawing>
+      </w:r>
+    </w:p>
+    <w:p>
+      <w:pPr>
+        <w:pStyle w:val="Heading2"/>
+      </w:pPr>
+      <w:r>
+        <w:t>Trompette+sourd. cup</w:t>
+      </w:r>
+    </w:p>
+    <w:p>
+      <w:pPr>
+        <w:jc w:val="center"/>
+      </w:pPr>
+      <w:r>
+        <w:drawing>
+          <wp:inline xmlns:a="http://schemas.openxmlformats.org/drawingml/2006/main" xmlns:pic="http://schemas.openxmlformats.org/drawingml/2006/picture">
+            <wp:extent cx="5486400" cy="2361235"/>
+            <wp:docPr id="17" name="Picture 17"/>
+            <wp:cNvGraphicFramePr>
+              <a:graphicFrameLocks noChangeAspect="1"/>
+            </wp:cNvGraphicFramePr>
+            <a:graphic>
+              <a:graphicData uri="http://schemas.openxmlformats.org/drawingml/2006/picture">
+                <pic:pic>
+                  <pic:nvPicPr>
+                    <pic:cNvPr id="0" name="specenv_trompette_sourd_cup.png"/>
+                    <pic:cNvPicPr/>
+                  </pic:nvPicPr>
+                  <pic:blipFill>
+                    <a:blip r:embed="rId25"/>
+                    <a:stretch>
+                      <a:fillRect/>
+                    </a:stretch>
+                  </pic:blipFill>
+                  <pic:spPr>
+                    <a:xfrm>
+                      <a:off x="0" y="0"/>
+                      <a:ext cx="5486400" cy="2361235"/>
+                    </a:xfrm>
+                    <a:prstGeom prst="rect"/>
+                  </pic:spPr>
+                </pic:pic>
+              </a:graphicData>
+            </a:graphic>
+          </wp:inline>
+        </w:drawing>
+      </w:r>
+    </w:p>
+    <w:p>
+      <w:pPr>
+        <w:pStyle w:val="Heading2"/>
+      </w:pPr>
+      <w:r>
+        <w:t>Trompette+sourd. sèche</w:t>
+      </w:r>
+    </w:p>
+    <w:p>
+      <w:pPr>
+        <w:jc w:val="center"/>
+      </w:pPr>
+      <w:r>
+        <w:drawing>
+          <wp:inline xmlns:a="http://schemas.openxmlformats.org/drawingml/2006/main" xmlns:pic="http://schemas.openxmlformats.org/drawingml/2006/picture">
+            <wp:extent cx="5486400" cy="2361235"/>
+            <wp:docPr id="18" name="Picture 18"/>
+            <wp:cNvGraphicFramePr>
+              <a:graphicFrameLocks noChangeAspect="1"/>
+            </wp:cNvGraphicFramePr>
+            <a:graphic>
+              <a:graphicData uri="http://schemas.openxmlformats.org/drawingml/2006/picture">
+                <pic:pic>
+                  <pic:nvPicPr>
+                    <pic:cNvPr id="0" name="specenv_trompette_sourd_seche.png"/>
+                    <pic:cNvPicPr/>
+                  </pic:nvPicPr>
+                  <pic:blipFill>
+                    <a:blip r:embed="rId26"/>
+                    <a:stretch>
+                      <a:fillRect/>
+                    </a:stretch>
+                  </pic:blipFill>
+                  <pic:spPr>
+                    <a:xfrm>
+                      <a:off x="0" y="0"/>
+                      <a:ext cx="5486400" cy="2361235"/>
+                    </a:xfrm>
+                    <a:prstGeom prst="rect"/>
+                  </pic:spPr>
+                </pic:pic>
+              </a:graphicData>
+            </a:graphic>
+          </wp:inline>
+        </w:drawing>
+      </w:r>
+    </w:p>
+    <w:p>
+      <w:pPr>
+        <w:pStyle w:val="Heading2"/>
+      </w:pPr>
+      <w:r>
+        <w:t>Trompette+sourd. harmon</w:t>
+      </w:r>
+    </w:p>
+    <w:p>
+      <w:pPr>
+        <w:jc w:val="center"/>
+      </w:pPr>
+      <w:r>
+        <w:drawing>
+          <wp:inline xmlns:a="http://schemas.openxmlformats.org/drawingml/2006/main" xmlns:pic="http://schemas.openxmlformats.org/drawingml/2006/picture">
+            <wp:extent cx="5486400" cy="2361235"/>
+            <wp:docPr id="19" name="Picture 19"/>
+            <wp:cNvGraphicFramePr>
+              <a:graphicFrameLocks noChangeAspect="1"/>
+            </wp:cNvGraphicFramePr>
+            <a:graphic>
+              <a:graphicData uri="http://schemas.openxmlformats.org/drawingml/2006/picture">
+                <pic:pic>
+                  <pic:nvPicPr>
+                    <pic:cNvPr id="0" name="specenv_trompette_sourd_harmon.png"/>
+                    <pic:cNvPicPr/>
+                  </pic:nvPicPr>
+                  <pic:blipFill>
+                    <a:blip r:embed="rId27"/>
+                    <a:stretch>
+                      <a:fillRect/>
+                    </a:stretch>
+                  </pic:blipFill>
+                  <pic:spPr>
+                    <a:xfrm>
+                      <a:off x="0" y="0"/>
+                      <a:ext cx="5486400" cy="2361235"/>
+                    </a:xfrm>
+                    <a:prstGeom prst="rect"/>
+                  </pic:spPr>
+                </pic:pic>
+              </a:graphicData>
+            </a:graphic>
+          </wp:inline>
+        </w:drawing>
+      </w:r>
+    </w:p>
+    <w:p>
+      <w:pPr>
+        <w:pStyle w:val="Heading2"/>
+      </w:pPr>
+      <w:r>
+        <w:t>Trompette+sourd. wah</w:t>
+      </w:r>
+    </w:p>
+    <w:p>
+      <w:pPr>
+        <w:jc w:val="center"/>
+      </w:pPr>
+      <w:r>
+        <w:drawing>
+          <wp:inline xmlns:a="http://schemas.openxmlformats.org/drawingml/2006/main" xmlns:pic="http://schemas.openxmlformats.org/drawingml/2006/picture">
+            <wp:extent cx="5486400" cy="2361235"/>
+            <wp:docPr id="20" name="Picture 20"/>
+            <wp:cNvGraphicFramePr>
+              <a:graphicFrameLocks noChangeAspect="1"/>
+            </wp:cNvGraphicFramePr>
+            <a:graphic>
+              <a:graphicData uri="http://schemas.openxmlformats.org/drawingml/2006/picture">
+                <pic:pic>
+                  <pic:nvPicPr>
+                    <pic:cNvPr id="0" name="specenv_trompette_sourd_wah.png"/>
+                    <pic:cNvPicPr/>
+                  </pic:nvPicPr>
+                  <pic:blipFill>
+                    <a:blip r:embed="rId28"/>
+                    <a:stretch>
+                      <a:fillRect/>
+                    </a:stretch>
+                  </pic:blipFill>
+                  <pic:spPr>
+                    <a:xfrm>
+                      <a:off x="0" y="0"/>
+                      <a:ext cx="5486400" cy="2361235"/>
+                    </a:xfrm>
+                    <a:prstGeom prst="rect"/>
+                  </pic:spPr>
+                </pic:pic>
+              </a:graphicData>
+            </a:graphic>
+          </wp:inline>
+        </w:drawing>
+      </w:r>
+    </w:p>
+    <w:p>
+      <w:pPr>
+        <w:pStyle w:val="Heading2"/>
+      </w:pPr>
+      <w:r>
+        <w:t>Trombone ténor</w:t>
+      </w:r>
+    </w:p>
+    <w:p>
+      <w:pPr>
+        <w:jc w:val="center"/>
+      </w:pPr>
+      <w:r>
+        <w:drawing>
+          <wp:inline xmlns:a="http://schemas.openxmlformats.org/drawingml/2006/main" xmlns:pic="http://schemas.openxmlformats.org/drawingml/2006/picture">
+            <wp:extent cx="5486400" cy="2361235"/>
+            <wp:docPr id="21" name="Picture 21"/>
+            <wp:cNvGraphicFramePr>
+              <a:graphicFrameLocks noChangeAspect="1"/>
+            </wp:cNvGraphicFramePr>
+            <a:graphic>
+              <a:graphicData uri="http://schemas.openxmlformats.org/drawingml/2006/picture">
+                <pic:pic>
+                  <pic:nvPicPr>
+                    <pic:cNvPr id="0" name="specenv_trombone_tenor.png"/>
+                    <pic:cNvPicPr/>
+                  </pic:nvPicPr>
+                  <pic:blipFill>
+                    <a:blip r:embed="rId29"/>
+                    <a:stretch>
+                      <a:fillRect/>
+                    </a:stretch>
+                  </pic:blipFill>
+                  <pic:spPr>
+                    <a:xfrm>
+                      <a:off x="0" y="0"/>
+                      <a:ext cx="5486400" cy="2361235"/>
+                    </a:xfrm>
+                    <a:prstGeom prst="rect"/>
+                  </pic:spPr>
+                </pic:pic>
+              </a:graphicData>
+            </a:graphic>
+          </wp:inline>
+        </w:drawing>
+      </w:r>
+    </w:p>
+    <w:p>
+      <w:pPr>
+        <w:pStyle w:val="Heading2"/>
+      </w:pPr>
+      <w:r>
+        <w:t>Trombone+sourd. cup</w:t>
+      </w:r>
+    </w:p>
+    <w:p>
+      <w:pPr>
+        <w:jc w:val="center"/>
+      </w:pPr>
+      <w:r>
+        <w:drawing>
+          <wp:inline xmlns:a="http://schemas.openxmlformats.org/drawingml/2006/main" xmlns:pic="http://schemas.openxmlformats.org/drawingml/2006/picture">
+            <wp:extent cx="5486400" cy="2361235"/>
+            <wp:docPr id="22" name="Picture 22"/>
+            <wp:cNvGraphicFramePr>
+              <a:graphicFrameLocks noChangeAspect="1"/>
+            </wp:cNvGraphicFramePr>
+            <a:graphic>
+              <a:graphicData uri="http://schemas.openxmlformats.org/drawingml/2006/picture">
+                <pic:pic>
+                  <pic:nvPicPr>
+                    <pic:cNvPr id="0" name="specenv_trombone_sourd_cup.png"/>
+                    <pic:cNvPicPr/>
+                  </pic:nvPicPr>
+                  <pic:blipFill>
+                    <a:blip r:embed="rId30"/>
+                    <a:stretch>
+                      <a:fillRect/>
+                    </a:stretch>
+                  </pic:blipFill>
+                  <pic:spPr>
+                    <a:xfrm>
+                      <a:off x="0" y="0"/>
+                      <a:ext cx="5486400" cy="2361235"/>
+                    </a:xfrm>
+                    <a:prstGeom prst="rect"/>
+                  </pic:spPr>
+                </pic:pic>
+              </a:graphicData>
+            </a:graphic>
+          </wp:inline>
+        </w:drawing>
+      </w:r>
+    </w:p>
+    <w:p>
+      <w:pPr>
+        <w:pStyle w:val="Heading2"/>
+      </w:pPr>
+      <w:r>
+        <w:t>Trombone+sourd. sèche</w:t>
+      </w:r>
+    </w:p>
+    <w:p>
+      <w:pPr>
+        <w:jc w:val="center"/>
+      </w:pPr>
+      <w:r>
+        <w:drawing>
+          <wp:inline xmlns:a="http://schemas.openxmlformats.org/drawingml/2006/main" xmlns:pic="http://schemas.openxmlformats.org/drawingml/2006/picture">
+            <wp:extent cx="5486400" cy="2361235"/>
+            <wp:docPr id="23" name="Picture 23"/>
+            <wp:cNvGraphicFramePr>
+              <a:graphicFrameLocks noChangeAspect="1"/>
+            </wp:cNvGraphicFramePr>
+            <a:graphic>
+              <a:graphicData uri="http://schemas.openxmlformats.org/drawingml/2006/picture">
+                <pic:pic>
+                  <pic:nvPicPr>
+                    <pic:cNvPr id="0" name="specenv_trombone_sourd_seche.png"/>
+                    <pic:cNvPicPr/>
+                  </pic:nvPicPr>
+                  <pic:blipFill>
+                    <a:blip r:embed="rId31"/>
+                    <a:stretch>
+                      <a:fillRect/>
+                    </a:stretch>
+                  </pic:blipFill>
+                  <pic:spPr>
+                    <a:xfrm>
+                      <a:off x="0" y="0"/>
+                      <a:ext cx="5486400" cy="2361235"/>
+                    </a:xfrm>
+                    <a:prstGeom prst="rect"/>
+                  </pic:spPr>
+                </pic:pic>
+              </a:graphicData>
+            </a:graphic>
+          </wp:inline>
+        </w:drawing>
+      </w:r>
+    </w:p>
+    <w:p>
+      <w:pPr>
+        <w:pStyle w:val="Heading2"/>
+      </w:pPr>
+      <w:r>
+        <w:t>Trombone+sourd. harmon</w:t>
+      </w:r>
+    </w:p>
+    <w:p>
+      <w:pPr>
+        <w:jc w:val="center"/>
+      </w:pPr>
+      <w:r>
+        <w:drawing>
+          <wp:inline xmlns:a="http://schemas.openxmlformats.org/drawingml/2006/main" xmlns:pic="http://schemas.openxmlformats.org/drawingml/2006/picture">
+            <wp:extent cx="5486400" cy="2361235"/>
+            <wp:docPr id="24" name="Picture 24"/>
+            <wp:cNvGraphicFramePr>
+              <a:graphicFrameLocks noChangeAspect="1"/>
+            </wp:cNvGraphicFramePr>
+            <a:graphic>
+              <a:graphicData uri="http://schemas.openxmlformats.org/drawingml/2006/picture">
+                <pic:pic>
+                  <pic:nvPicPr>
+                    <pic:cNvPr id="0" name="specenv_trombone_sourd_harmon.png"/>
+                    <pic:cNvPicPr/>
+                  </pic:nvPicPr>
+                  <pic:blipFill>
+                    <a:blip r:embed="rId32"/>
+                    <a:stretch>
+                      <a:fillRect/>
+                    </a:stretch>
+                  </pic:blipFill>
+                  <pic:spPr>
+                    <a:xfrm>
+                      <a:off x="0" y="0"/>
+                      <a:ext cx="5486400" cy="2361235"/>
+                    </a:xfrm>
+                    <a:prstGeom prst="rect"/>
+                  </pic:spPr>
+                </pic:pic>
+              </a:graphicData>
+            </a:graphic>
+          </wp:inline>
+        </w:drawing>
+      </w:r>
+    </w:p>
+    <w:p>
+      <w:pPr>
+        <w:pStyle w:val="Heading2"/>
+      </w:pPr>
+      <w:r>
+        <w:t>Trombone+sourd. wah</w:t>
+      </w:r>
+    </w:p>
+    <w:p>
+      <w:pPr>
+        <w:jc w:val="center"/>
+      </w:pPr>
+      <w:r>
+        <w:drawing>
+          <wp:inline xmlns:a="http://schemas.openxmlformats.org/drawingml/2006/main" xmlns:pic="http://schemas.openxmlformats.org/drawingml/2006/picture">
+            <wp:extent cx="5486400" cy="2361235"/>
+            <wp:docPr id="25" name="Picture 25"/>
+            <wp:cNvGraphicFramePr>
+              <a:graphicFrameLocks noChangeAspect="1"/>
+            </wp:cNvGraphicFramePr>
+            <a:graphic>
+              <a:graphicData uri="http://schemas.openxmlformats.org/drawingml/2006/picture">
+                <pic:pic>
+                  <pic:nvPicPr>
+                    <pic:cNvPr id="0" name="specenv_trombone_sourd_wah.png"/>
+                    <pic:cNvPicPr/>
+                  </pic:nvPicPr>
+                  <pic:blipFill>
+                    <a:blip r:embed="rId33"/>
+                    <a:stretch>
+                      <a:fillRect/>
+                    </a:stretch>
+                  </pic:blipFill>
+                  <pic:spPr>
+                    <a:xfrm>
+                      <a:off x="0" y="0"/>
+                      <a:ext cx="5486400" cy="2361235"/>
+                    </a:xfrm>
+                    <a:prstGeom prst="rect"/>
+                  </pic:spPr>
+                </pic:pic>
+              </a:graphicData>
+            </a:graphic>
+          </wp:inline>
+        </w:drawing>
+      </w:r>
+    </w:p>
+    <w:p>
+      <w:pPr>
+        <w:pStyle w:val="Heading2"/>
+      </w:pPr>
+      <w:r>
+        <w:t>Trombone basse</w:t>
+      </w:r>
+    </w:p>
+    <w:p>
+      <w:pPr>
+        <w:jc w:val="center"/>
+      </w:pPr>
+      <w:r>
+        <w:drawing>
+          <wp:inline xmlns:a="http://schemas.openxmlformats.org/drawingml/2006/main" xmlns:pic="http://schemas.openxmlformats.org/drawingml/2006/picture">
+            <wp:extent cx="5486400" cy="2361235"/>
+            <wp:docPr id="26" name="Picture 26"/>
+            <wp:cNvGraphicFramePr>
+              <a:graphicFrameLocks noChangeAspect="1"/>
+            </wp:cNvGraphicFramePr>
+            <a:graphic>
+              <a:graphicData uri="http://schemas.openxmlformats.org/drawingml/2006/picture">
+                <pic:pic>
+                  <pic:nvPicPr>
+                    <pic:cNvPr id="0" name="specenv_trombone_basse.png"/>
+                    <pic:cNvPicPr/>
+                  </pic:nvPicPr>
+                  <pic:blipFill>
+                    <a:blip r:embed="rId34"/>
+                    <a:stretch>
+                      <a:fillRect/>
+                    </a:stretch>
+                  </pic:blipFill>
+                  <pic:spPr>
+                    <a:xfrm>
+                      <a:off x="0" y="0"/>
+                      <a:ext cx="5486400" cy="2361235"/>
+                    </a:xfrm>
+                    <a:prstGeom prst="rect"/>
+                  </pic:spPr>
+                </pic:pic>
+              </a:graphicData>
+            </a:graphic>
+          </wp:inline>
+        </w:drawing>
+      </w:r>
+    </w:p>
+    <w:p>
+      <w:pPr>
+        <w:pStyle w:val="Heading2"/>
+      </w:pPr>
+      <w:r>
+        <w:t>Tuba basse</w:t>
+      </w:r>
+    </w:p>
+    <w:p>
+      <w:pPr>
+        <w:jc w:val="center"/>
+      </w:pPr>
+      <w:r>
+        <w:drawing>
+          <wp:inline xmlns:a="http://schemas.openxmlformats.org/drawingml/2006/main" xmlns:pic="http://schemas.openxmlformats.org/drawingml/2006/picture">
+            <wp:extent cx="5486400" cy="2361235"/>
+            <wp:docPr id="27" name="Picture 27"/>
+            <wp:cNvGraphicFramePr>
+              <a:graphicFrameLocks noChangeAspect="1"/>
+            </wp:cNvGraphicFramePr>
+            <a:graphic>
+              <a:graphicData uri="http://schemas.openxmlformats.org/drawingml/2006/picture">
+                <pic:pic>
+                  <pic:nvPicPr>
+                    <pic:cNvPr id="0" name="specenv_tuba_basse.png"/>
+                    <pic:cNvPicPr/>
+                  </pic:nvPicPr>
+                  <pic:blipFill>
+                    <a:blip r:embed="rId35"/>
+                    <a:stretch>
+                      <a:fillRect/>
+                    </a:stretch>
+                  </pic:blipFill>
+                  <pic:spPr>
+                    <a:xfrm>
+                      <a:off x="0" y="0"/>
+                      <a:ext cx="5486400" cy="2361235"/>
+                    </a:xfrm>
+                    <a:prstGeom prst="rect"/>
+                  </pic:spPr>
+                </pic:pic>
+              </a:graphicData>
+            </a:graphic>
+          </wp:inline>
+        </w:drawing>
+      </w:r>
+    </w:p>
+    <w:p>
+      <w:pPr>
+        <w:pStyle w:val="Heading2"/>
+      </w:pPr>
+      <w:r>
+        <w:t>Tuba basse+sourdine</w:t>
+      </w:r>
+    </w:p>
+    <w:p>
+      <w:pPr>
+        <w:jc w:val="center"/>
+      </w:pPr>
+      <w:r>
+        <w:drawing>
+          <wp:inline xmlns:a="http://schemas.openxmlformats.org/drawingml/2006/main" xmlns:pic="http://schemas.openxmlformats.org/drawingml/2006/picture">
+            <wp:extent cx="5486400" cy="2361235"/>
+            <wp:docPr id="28" name="Picture 28"/>
+            <wp:cNvGraphicFramePr>
+              <a:graphicFrameLocks noChangeAspect="1"/>
+            </wp:cNvGraphicFramePr>
+            <a:graphic>
+              <a:graphicData uri="http://schemas.openxmlformats.org/drawingml/2006/picture">
+                <pic:pic>
+                  <pic:nvPicPr>
+                    <pic:cNvPr id="0" name="specenv_tuba_basse_sourdine.png"/>
+                    <pic:cNvPicPr/>
+                  </pic:nvPicPr>
+                  <pic:blipFill>
+                    <a:blip r:embed="rId36"/>
+                    <a:stretch>
+                      <a:fillRect/>
+                    </a:stretch>
+                  </pic:blipFill>
+                  <pic:spPr>
+                    <a:xfrm>
+                      <a:off x="0" y="0"/>
+                      <a:ext cx="5486400" cy="2361235"/>
+                    </a:xfrm>
+                    <a:prstGeom prst="rect"/>
+                  </pic:spPr>
+                </pic:pic>
+              </a:graphicData>
+            </a:graphic>
+          </wp:inline>
+        </w:drawing>
+      </w:r>
+    </w:p>
+    <w:p>
+      <w:pPr>
+        <w:pStyle w:val="Heading2"/>
+      </w:pPr>
+      <w:r>
+        <w:t>Tuba contrebasse</w:t>
+      </w:r>
+    </w:p>
+    <w:p>
+      <w:pPr>
+        <w:jc w:val="center"/>
+      </w:pPr>
+      <w:r>
+        <w:drawing>
+          <wp:inline xmlns:a="http://schemas.openxmlformats.org/drawingml/2006/main" xmlns:pic="http://schemas.openxmlformats.org/drawingml/2006/picture">
+            <wp:extent cx="5486400" cy="2361235"/>
+            <wp:docPr id="29" name="Picture 29"/>
+            <wp:cNvGraphicFramePr>
+              <a:graphicFrameLocks noChangeAspect="1"/>
+            </wp:cNvGraphicFramePr>
+            <a:graphic>
+              <a:graphicData uri="http://schemas.openxmlformats.org/drawingml/2006/picture">
+                <pic:pic>
+                  <pic:nvPicPr>
+                    <pic:cNvPr id="0" name="specenv_tuba_contrebasse.png"/>
+                    <pic:cNvPicPr/>
+                  </pic:nvPicPr>
+                  <pic:blipFill>
+                    <a:blip r:embed="rId37"/>
+                    <a:stretch>
+                      <a:fillRect/>
+                    </a:stretch>
+                  </pic:blipFill>
+                  <pic:spPr>
+                    <a:xfrm>
+                      <a:off x="0" y="0"/>
+                      <a:ext cx="5486400" cy="2361235"/>
                     </a:xfrm>
                     <a:prstGeom prst="rect"/>
                   </pic:spPr>
@@ -152,13 +1406,11 @@
       </w:r>
     </w:p>
     <w:p>
+      <w:pPr>
+        <w:pStyle w:val="Heading2"/>
+      </w:pPr>
       <w:r>
-        <w:t>Les cordes se distinguent par des plateaux spectraux et des résonances larges ; le repère Fp y est particulièrement utile.</w:t>
-      </w:r>
-    </w:p>
-    <w:p>
-      <w:r>
-        <w:t>Instruments chargés : 8 / 8 — Échantillons : 1730</w:t>
+        <w:t>Violon</w:t>
       </w:r>
     </w:p>
     <w:p>
@@ -168,8 +1420,8 @@
       <w:r>
         <w:drawing>
           <wp:inline xmlns:a="http://schemas.openxmlformats.org/drawingml/2006/main" xmlns:pic="http://schemas.openxmlformats.org/drawingml/2006/picture">
-            <wp:extent cx="6217920" cy="8694821"/>
-            <wp:docPr id="3" name="Picture 3"/>
+            <wp:extent cx="5486400" cy="2361235"/>
+            <wp:docPr id="30" name="Picture 30"/>
             <wp:cNvGraphicFramePr>
               <a:graphicFrameLocks noChangeAspect="1"/>
             </wp:cNvGraphicFramePr>
@@ -177,11 +1429,11 @@
               <a:graphicData uri="http://schemas.openxmlformats.org/drawingml/2006/picture">
                 <pic:pic>
                   <pic:nvPicPr>
-                    <pic:cNvPr id="0" name="enveloppes_cordes.png"/>
+                    <pic:cNvPr id="0" name="specenv_violon.png"/>
                     <pic:cNvPicPr/>
                   </pic:nvPicPr>
                   <pic:blipFill>
-                    <a:blip r:embed="rId11"/>
+                    <a:blip r:embed="rId38"/>
                     <a:stretch>
                       <a:fillRect/>
                     </a:stretch>
@@ -189,7 +1441,7 @@
                   <pic:spPr>
                     <a:xfrm>
                       <a:off x="0" y="0"/>
-                      <a:ext cx="6217920" cy="8694821"/>
+                      <a:ext cx="5486400" cy="2361235"/>
                     </a:xfrm>
                     <a:prstGeom prst="rect"/>
                   </pic:spPr>
@@ -201,11 +1453,802 @@
       </w:r>
     </w:p>
     <w:p>
+      <w:pPr>
+        <w:pStyle w:val="Heading2"/>
+      </w:pPr>
       <w:r>
-        <w:rPr>
-          <w:sz w:val="18"/>
-        </w:rPr>
-        <w:t>Sources : exports specenv bruts SOL2020 + Yan_Adds-Divers.</w:t>
+        <w:t>Violon+sourdine</w:t>
+      </w:r>
+    </w:p>
+    <w:p>
+      <w:pPr>
+        <w:jc w:val="center"/>
+      </w:pPr>
+      <w:r>
+        <w:drawing>
+          <wp:inline xmlns:a="http://schemas.openxmlformats.org/drawingml/2006/main" xmlns:pic="http://schemas.openxmlformats.org/drawingml/2006/picture">
+            <wp:extent cx="5486400" cy="2361235"/>
+            <wp:docPr id="31" name="Picture 31"/>
+            <wp:cNvGraphicFramePr>
+              <a:graphicFrameLocks noChangeAspect="1"/>
+            </wp:cNvGraphicFramePr>
+            <a:graphic>
+              <a:graphicData uri="http://schemas.openxmlformats.org/drawingml/2006/picture">
+                <pic:pic>
+                  <pic:nvPicPr>
+                    <pic:cNvPr id="0" name="specenv_violon_sourdine.png"/>
+                    <pic:cNvPicPr/>
+                  </pic:nvPicPr>
+                  <pic:blipFill>
+                    <a:blip r:embed="rId39"/>
+                    <a:stretch>
+                      <a:fillRect/>
+                    </a:stretch>
+                  </pic:blipFill>
+                  <pic:spPr>
+                    <a:xfrm>
+                      <a:off x="0" y="0"/>
+                      <a:ext cx="5486400" cy="2361235"/>
+                    </a:xfrm>
+                    <a:prstGeom prst="rect"/>
+                  </pic:spPr>
+                </pic:pic>
+              </a:graphicData>
+            </a:graphic>
+          </wp:inline>
+        </w:drawing>
+      </w:r>
+    </w:p>
+    <w:p>
+      <w:pPr>
+        <w:pStyle w:val="Heading2"/>
+      </w:pPr>
+      <w:r>
+        <w:t>Violon+sourd. piombo</w:t>
+      </w:r>
+    </w:p>
+    <w:p>
+      <w:pPr>
+        <w:jc w:val="center"/>
+      </w:pPr>
+      <w:r>
+        <w:drawing>
+          <wp:inline xmlns:a="http://schemas.openxmlformats.org/drawingml/2006/main" xmlns:pic="http://schemas.openxmlformats.org/drawingml/2006/picture">
+            <wp:extent cx="5486400" cy="2361235"/>
+            <wp:docPr id="32" name="Picture 32"/>
+            <wp:cNvGraphicFramePr>
+              <a:graphicFrameLocks noChangeAspect="1"/>
+            </wp:cNvGraphicFramePr>
+            <a:graphic>
+              <a:graphicData uri="http://schemas.openxmlformats.org/drawingml/2006/picture">
+                <pic:pic>
+                  <pic:nvPicPr>
+                    <pic:cNvPr id="0" name="specenv_violon_sourd_piombo.png"/>
+                    <pic:cNvPicPr/>
+                  </pic:nvPicPr>
+                  <pic:blipFill>
+                    <a:blip r:embed="rId40"/>
+                    <a:stretch>
+                      <a:fillRect/>
+                    </a:stretch>
+                  </pic:blipFill>
+                  <pic:spPr>
+                    <a:xfrm>
+                      <a:off x="0" y="0"/>
+                      <a:ext cx="5486400" cy="2361235"/>
+                    </a:xfrm>
+                    <a:prstGeom prst="rect"/>
+                  </pic:spPr>
+                </pic:pic>
+              </a:graphicData>
+            </a:graphic>
+          </wp:inline>
+        </w:drawing>
+      </w:r>
+    </w:p>
+    <w:p>
+      <w:pPr>
+        <w:pStyle w:val="Heading2"/>
+      </w:pPr>
+      <w:r>
+        <w:t>Alto</w:t>
+      </w:r>
+    </w:p>
+    <w:p>
+      <w:pPr>
+        <w:jc w:val="center"/>
+      </w:pPr>
+      <w:r>
+        <w:drawing>
+          <wp:inline xmlns:a="http://schemas.openxmlformats.org/drawingml/2006/main" xmlns:pic="http://schemas.openxmlformats.org/drawingml/2006/picture">
+            <wp:extent cx="5486400" cy="2361235"/>
+            <wp:docPr id="33" name="Picture 33"/>
+            <wp:cNvGraphicFramePr>
+              <a:graphicFrameLocks noChangeAspect="1"/>
+            </wp:cNvGraphicFramePr>
+            <a:graphic>
+              <a:graphicData uri="http://schemas.openxmlformats.org/drawingml/2006/picture">
+                <pic:pic>
+                  <pic:nvPicPr>
+                    <pic:cNvPr id="0" name="specenv_alto.png"/>
+                    <pic:cNvPicPr/>
+                  </pic:nvPicPr>
+                  <pic:blipFill>
+                    <a:blip r:embed="rId41"/>
+                    <a:stretch>
+                      <a:fillRect/>
+                    </a:stretch>
+                  </pic:blipFill>
+                  <pic:spPr>
+                    <a:xfrm>
+                      <a:off x="0" y="0"/>
+                      <a:ext cx="5486400" cy="2361235"/>
+                    </a:xfrm>
+                    <a:prstGeom prst="rect"/>
+                  </pic:spPr>
+                </pic:pic>
+              </a:graphicData>
+            </a:graphic>
+          </wp:inline>
+        </w:drawing>
+      </w:r>
+    </w:p>
+    <w:p>
+      <w:pPr>
+        <w:pStyle w:val="Heading2"/>
+      </w:pPr>
+      <w:r>
+        <w:t>Alto+sourdine</w:t>
+      </w:r>
+    </w:p>
+    <w:p>
+      <w:pPr>
+        <w:jc w:val="center"/>
+      </w:pPr>
+      <w:r>
+        <w:drawing>
+          <wp:inline xmlns:a="http://schemas.openxmlformats.org/drawingml/2006/main" xmlns:pic="http://schemas.openxmlformats.org/drawingml/2006/picture">
+            <wp:extent cx="5486400" cy="2361235"/>
+            <wp:docPr id="34" name="Picture 34"/>
+            <wp:cNvGraphicFramePr>
+              <a:graphicFrameLocks noChangeAspect="1"/>
+            </wp:cNvGraphicFramePr>
+            <a:graphic>
+              <a:graphicData uri="http://schemas.openxmlformats.org/drawingml/2006/picture">
+                <pic:pic>
+                  <pic:nvPicPr>
+                    <pic:cNvPr id="0" name="specenv_alto_sourdine.png"/>
+                    <pic:cNvPicPr/>
+                  </pic:nvPicPr>
+                  <pic:blipFill>
+                    <a:blip r:embed="rId42"/>
+                    <a:stretch>
+                      <a:fillRect/>
+                    </a:stretch>
+                  </pic:blipFill>
+                  <pic:spPr>
+                    <a:xfrm>
+                      <a:off x="0" y="0"/>
+                      <a:ext cx="5486400" cy="2361235"/>
+                    </a:xfrm>
+                    <a:prstGeom prst="rect"/>
+                  </pic:spPr>
+                </pic:pic>
+              </a:graphicData>
+            </a:graphic>
+          </wp:inline>
+        </w:drawing>
+      </w:r>
+    </w:p>
+    <w:p>
+      <w:pPr>
+        <w:pStyle w:val="Heading2"/>
+      </w:pPr>
+      <w:r>
+        <w:t>Alto+sourd. piombo</w:t>
+      </w:r>
+    </w:p>
+    <w:p>
+      <w:pPr>
+        <w:jc w:val="center"/>
+      </w:pPr>
+      <w:r>
+        <w:drawing>
+          <wp:inline xmlns:a="http://schemas.openxmlformats.org/drawingml/2006/main" xmlns:pic="http://schemas.openxmlformats.org/drawingml/2006/picture">
+            <wp:extent cx="5486400" cy="2361235"/>
+            <wp:docPr id="35" name="Picture 35"/>
+            <wp:cNvGraphicFramePr>
+              <a:graphicFrameLocks noChangeAspect="1"/>
+            </wp:cNvGraphicFramePr>
+            <a:graphic>
+              <a:graphicData uri="http://schemas.openxmlformats.org/drawingml/2006/picture">
+                <pic:pic>
+                  <pic:nvPicPr>
+                    <pic:cNvPr id="0" name="specenv_alto_sourd_piombo.png"/>
+                    <pic:cNvPicPr/>
+                  </pic:nvPicPr>
+                  <pic:blipFill>
+                    <a:blip r:embed="rId43"/>
+                    <a:stretch>
+                      <a:fillRect/>
+                    </a:stretch>
+                  </pic:blipFill>
+                  <pic:spPr>
+                    <a:xfrm>
+                      <a:off x="0" y="0"/>
+                      <a:ext cx="5486400" cy="2361235"/>
+                    </a:xfrm>
+                    <a:prstGeom prst="rect"/>
+                  </pic:spPr>
+                </pic:pic>
+              </a:graphicData>
+            </a:graphic>
+          </wp:inline>
+        </w:drawing>
+      </w:r>
+    </w:p>
+    <w:p>
+      <w:pPr>
+        <w:pStyle w:val="Heading2"/>
+      </w:pPr>
+      <w:r>
+        <w:t>Violoncelle</w:t>
+      </w:r>
+    </w:p>
+    <w:p>
+      <w:pPr>
+        <w:jc w:val="center"/>
+      </w:pPr>
+      <w:r>
+        <w:drawing>
+          <wp:inline xmlns:a="http://schemas.openxmlformats.org/drawingml/2006/main" xmlns:pic="http://schemas.openxmlformats.org/drawingml/2006/picture">
+            <wp:extent cx="5486400" cy="2361235"/>
+            <wp:docPr id="36" name="Picture 36"/>
+            <wp:cNvGraphicFramePr>
+              <a:graphicFrameLocks noChangeAspect="1"/>
+            </wp:cNvGraphicFramePr>
+            <a:graphic>
+              <a:graphicData uri="http://schemas.openxmlformats.org/drawingml/2006/picture">
+                <pic:pic>
+                  <pic:nvPicPr>
+                    <pic:cNvPr id="0" name="specenv_violoncelle.png"/>
+                    <pic:cNvPicPr/>
+                  </pic:nvPicPr>
+                  <pic:blipFill>
+                    <a:blip r:embed="rId44"/>
+                    <a:stretch>
+                      <a:fillRect/>
+                    </a:stretch>
+                  </pic:blipFill>
+                  <pic:spPr>
+                    <a:xfrm>
+                      <a:off x="0" y="0"/>
+                      <a:ext cx="5486400" cy="2361235"/>
+                    </a:xfrm>
+                    <a:prstGeom prst="rect"/>
+                  </pic:spPr>
+                </pic:pic>
+              </a:graphicData>
+            </a:graphic>
+          </wp:inline>
+        </w:drawing>
+      </w:r>
+    </w:p>
+    <w:p>
+      <w:pPr>
+        <w:pStyle w:val="Heading2"/>
+      </w:pPr>
+      <w:r>
+        <w:t>Violoncelle+sourdine</w:t>
+      </w:r>
+    </w:p>
+    <w:p>
+      <w:pPr>
+        <w:jc w:val="center"/>
+      </w:pPr>
+      <w:r>
+        <w:drawing>
+          <wp:inline xmlns:a="http://schemas.openxmlformats.org/drawingml/2006/main" xmlns:pic="http://schemas.openxmlformats.org/drawingml/2006/picture">
+            <wp:extent cx="5486400" cy="2361235"/>
+            <wp:docPr id="37" name="Picture 37"/>
+            <wp:cNvGraphicFramePr>
+              <a:graphicFrameLocks noChangeAspect="1"/>
+            </wp:cNvGraphicFramePr>
+            <a:graphic>
+              <a:graphicData uri="http://schemas.openxmlformats.org/drawingml/2006/picture">
+                <pic:pic>
+                  <pic:nvPicPr>
+                    <pic:cNvPr id="0" name="specenv_violoncelle_sourdine.png"/>
+                    <pic:cNvPicPr/>
+                  </pic:nvPicPr>
+                  <pic:blipFill>
+                    <a:blip r:embed="rId45"/>
+                    <a:stretch>
+                      <a:fillRect/>
+                    </a:stretch>
+                  </pic:blipFill>
+                  <pic:spPr>
+                    <a:xfrm>
+                      <a:off x="0" y="0"/>
+                      <a:ext cx="5486400" cy="2361235"/>
+                    </a:xfrm>
+                    <a:prstGeom prst="rect"/>
+                  </pic:spPr>
+                </pic:pic>
+              </a:graphicData>
+            </a:graphic>
+          </wp:inline>
+        </w:drawing>
+      </w:r>
+    </w:p>
+    <w:p>
+      <w:pPr>
+        <w:pStyle w:val="Heading2"/>
+      </w:pPr>
+      <w:r>
+        <w:t>Violoncelle+sourd. piombo</w:t>
+      </w:r>
+    </w:p>
+    <w:p>
+      <w:pPr>
+        <w:jc w:val="center"/>
+      </w:pPr>
+      <w:r>
+        <w:drawing>
+          <wp:inline xmlns:a="http://schemas.openxmlformats.org/drawingml/2006/main" xmlns:pic="http://schemas.openxmlformats.org/drawingml/2006/picture">
+            <wp:extent cx="5486400" cy="2361235"/>
+            <wp:docPr id="38" name="Picture 38"/>
+            <wp:cNvGraphicFramePr>
+              <a:graphicFrameLocks noChangeAspect="1"/>
+            </wp:cNvGraphicFramePr>
+            <a:graphic>
+              <a:graphicData uri="http://schemas.openxmlformats.org/drawingml/2006/picture">
+                <pic:pic>
+                  <pic:nvPicPr>
+                    <pic:cNvPr id="0" name="specenv_violoncelle_sourd_piombo.png"/>
+                    <pic:cNvPicPr/>
+                  </pic:nvPicPr>
+                  <pic:blipFill>
+                    <a:blip r:embed="rId46"/>
+                    <a:stretch>
+                      <a:fillRect/>
+                    </a:stretch>
+                  </pic:blipFill>
+                  <pic:spPr>
+                    <a:xfrm>
+                      <a:off x="0" y="0"/>
+                      <a:ext cx="5486400" cy="2361235"/>
+                    </a:xfrm>
+                    <a:prstGeom prst="rect"/>
+                  </pic:spPr>
+                </pic:pic>
+              </a:graphicData>
+            </a:graphic>
+          </wp:inline>
+        </w:drawing>
+      </w:r>
+    </w:p>
+    <w:p>
+      <w:pPr>
+        <w:pStyle w:val="Heading2"/>
+      </w:pPr>
+      <w:r>
+        <w:t>Contrebasse</w:t>
+      </w:r>
+    </w:p>
+    <w:p>
+      <w:pPr>
+        <w:jc w:val="center"/>
+      </w:pPr>
+      <w:r>
+        <w:drawing>
+          <wp:inline xmlns:a="http://schemas.openxmlformats.org/drawingml/2006/main" xmlns:pic="http://schemas.openxmlformats.org/drawingml/2006/picture">
+            <wp:extent cx="5486400" cy="2361235"/>
+            <wp:docPr id="39" name="Picture 39"/>
+            <wp:cNvGraphicFramePr>
+              <a:graphicFrameLocks noChangeAspect="1"/>
+            </wp:cNvGraphicFramePr>
+            <a:graphic>
+              <a:graphicData uri="http://schemas.openxmlformats.org/drawingml/2006/picture">
+                <pic:pic>
+                  <pic:nvPicPr>
+                    <pic:cNvPr id="0" name="specenv_contrebasse.png"/>
+                    <pic:cNvPicPr/>
+                  </pic:nvPicPr>
+                  <pic:blipFill>
+                    <a:blip r:embed="rId47"/>
+                    <a:stretch>
+                      <a:fillRect/>
+                    </a:stretch>
+                  </pic:blipFill>
+                  <pic:spPr>
+                    <a:xfrm>
+                      <a:off x="0" y="0"/>
+                      <a:ext cx="5486400" cy="2361235"/>
+                    </a:xfrm>
+                    <a:prstGeom prst="rect"/>
+                  </pic:spPr>
+                </pic:pic>
+              </a:graphicData>
+            </a:graphic>
+          </wp:inline>
+        </w:drawing>
+      </w:r>
+    </w:p>
+    <w:p>
+      <w:pPr>
+        <w:pStyle w:val="Heading2"/>
+      </w:pPr>
+      <w:r>
+        <w:t>Contrebasse+sourdine</w:t>
+      </w:r>
+    </w:p>
+    <w:p>
+      <w:pPr>
+        <w:jc w:val="center"/>
+      </w:pPr>
+      <w:r>
+        <w:drawing>
+          <wp:inline xmlns:a="http://schemas.openxmlformats.org/drawingml/2006/main" xmlns:pic="http://schemas.openxmlformats.org/drawingml/2006/picture">
+            <wp:extent cx="5486400" cy="2361235"/>
+            <wp:docPr id="40" name="Picture 40"/>
+            <wp:cNvGraphicFramePr>
+              <a:graphicFrameLocks noChangeAspect="1"/>
+            </wp:cNvGraphicFramePr>
+            <a:graphic>
+              <a:graphicData uri="http://schemas.openxmlformats.org/drawingml/2006/picture">
+                <pic:pic>
+                  <pic:nvPicPr>
+                    <pic:cNvPr id="0" name="specenv_contrebasse_sourdine.png"/>
+                    <pic:cNvPicPr/>
+                  </pic:nvPicPr>
+                  <pic:blipFill>
+                    <a:blip r:embed="rId48"/>
+                    <a:stretch>
+                      <a:fillRect/>
+                    </a:stretch>
+                  </pic:blipFill>
+                  <pic:spPr>
+                    <a:xfrm>
+                      <a:off x="0" y="0"/>
+                      <a:ext cx="5486400" cy="2361235"/>
+                    </a:xfrm>
+                    <a:prstGeom prst="rect"/>
+                  </pic:spPr>
+                </pic:pic>
+              </a:graphicData>
+            </a:graphic>
+          </wp:inline>
+        </w:drawing>
+      </w:r>
+    </w:p>
+    <w:p>
+      <w:pPr>
+        <w:pStyle w:val="Heading2"/>
+      </w:pPr>
+      <w:r>
+        <w:t>Ens. violons</w:t>
+      </w:r>
+    </w:p>
+    <w:p>
+      <w:pPr>
+        <w:jc w:val="center"/>
+      </w:pPr>
+      <w:r>
+        <w:drawing>
+          <wp:inline xmlns:a="http://schemas.openxmlformats.org/drawingml/2006/main" xmlns:pic="http://schemas.openxmlformats.org/drawingml/2006/picture">
+            <wp:extent cx="5486400" cy="2361235"/>
+            <wp:docPr id="41" name="Picture 41"/>
+            <wp:cNvGraphicFramePr>
+              <a:graphicFrameLocks noChangeAspect="1"/>
+            </wp:cNvGraphicFramePr>
+            <a:graphic>
+              <a:graphicData uri="http://schemas.openxmlformats.org/drawingml/2006/picture">
+                <pic:pic>
+                  <pic:nvPicPr>
+                    <pic:cNvPr id="0" name="specenv_ens_violons.png"/>
+                    <pic:cNvPicPr/>
+                  </pic:nvPicPr>
+                  <pic:blipFill>
+                    <a:blip r:embed="rId49"/>
+                    <a:stretch>
+                      <a:fillRect/>
+                    </a:stretch>
+                  </pic:blipFill>
+                  <pic:spPr>
+                    <a:xfrm>
+                      <a:off x="0" y="0"/>
+                      <a:ext cx="5486400" cy="2361235"/>
+                    </a:xfrm>
+                    <a:prstGeom prst="rect"/>
+                  </pic:spPr>
+                </pic:pic>
+              </a:graphicData>
+            </a:graphic>
+          </wp:inline>
+        </w:drawing>
+      </w:r>
+    </w:p>
+    <w:p>
+      <w:pPr>
+        <w:pStyle w:val="Heading2"/>
+      </w:pPr>
+      <w:r>
+        <w:t>Ens. violons+sourdine</w:t>
+      </w:r>
+    </w:p>
+    <w:p>
+      <w:pPr>
+        <w:jc w:val="center"/>
+      </w:pPr>
+      <w:r>
+        <w:drawing>
+          <wp:inline xmlns:a="http://schemas.openxmlformats.org/drawingml/2006/main" xmlns:pic="http://schemas.openxmlformats.org/drawingml/2006/picture">
+            <wp:extent cx="5486400" cy="2361235"/>
+            <wp:docPr id="42" name="Picture 42"/>
+            <wp:cNvGraphicFramePr>
+              <a:graphicFrameLocks noChangeAspect="1"/>
+            </wp:cNvGraphicFramePr>
+            <a:graphic>
+              <a:graphicData uri="http://schemas.openxmlformats.org/drawingml/2006/picture">
+                <pic:pic>
+                  <pic:nvPicPr>
+                    <pic:cNvPr id="0" name="specenv_ens_violons_sourdine.png"/>
+                    <pic:cNvPicPr/>
+                  </pic:nvPicPr>
+                  <pic:blipFill>
+                    <a:blip r:embed="rId50"/>
+                    <a:stretch>
+                      <a:fillRect/>
+                    </a:stretch>
+                  </pic:blipFill>
+                  <pic:spPr>
+                    <a:xfrm>
+                      <a:off x="0" y="0"/>
+                      <a:ext cx="5486400" cy="2361235"/>
+                    </a:xfrm>
+                    <a:prstGeom prst="rect"/>
+                  </pic:spPr>
+                </pic:pic>
+              </a:graphicData>
+            </a:graphic>
+          </wp:inline>
+        </w:drawing>
+      </w:r>
+    </w:p>
+    <w:p>
+      <w:pPr>
+        <w:pStyle w:val="Heading2"/>
+      </w:pPr>
+      <w:r>
+        <w:t>Ens. altos</w:t>
+      </w:r>
+    </w:p>
+    <w:p>
+      <w:pPr>
+        <w:jc w:val="center"/>
+      </w:pPr>
+      <w:r>
+        <w:drawing>
+          <wp:inline xmlns:a="http://schemas.openxmlformats.org/drawingml/2006/main" xmlns:pic="http://schemas.openxmlformats.org/drawingml/2006/picture">
+            <wp:extent cx="5486400" cy="2361235"/>
+            <wp:docPr id="43" name="Picture 43"/>
+            <wp:cNvGraphicFramePr>
+              <a:graphicFrameLocks noChangeAspect="1"/>
+            </wp:cNvGraphicFramePr>
+            <a:graphic>
+              <a:graphicData uri="http://schemas.openxmlformats.org/drawingml/2006/picture">
+                <pic:pic>
+                  <pic:nvPicPr>
+                    <pic:cNvPr id="0" name="specenv_ens_altos.png"/>
+                    <pic:cNvPicPr/>
+                  </pic:nvPicPr>
+                  <pic:blipFill>
+                    <a:blip r:embed="rId51"/>
+                    <a:stretch>
+                      <a:fillRect/>
+                    </a:stretch>
+                  </pic:blipFill>
+                  <pic:spPr>
+                    <a:xfrm>
+                      <a:off x="0" y="0"/>
+                      <a:ext cx="5486400" cy="2361235"/>
+                    </a:xfrm>
+                    <a:prstGeom prst="rect"/>
+                  </pic:spPr>
+                </pic:pic>
+              </a:graphicData>
+            </a:graphic>
+          </wp:inline>
+        </w:drawing>
+      </w:r>
+    </w:p>
+    <w:p>
+      <w:pPr>
+        <w:pStyle w:val="Heading2"/>
+      </w:pPr>
+      <w:r>
+        <w:t>Ens. altos+sourdine</w:t>
+      </w:r>
+    </w:p>
+    <w:p>
+      <w:pPr>
+        <w:jc w:val="center"/>
+      </w:pPr>
+      <w:r>
+        <w:drawing>
+          <wp:inline xmlns:a="http://schemas.openxmlformats.org/drawingml/2006/main" xmlns:pic="http://schemas.openxmlformats.org/drawingml/2006/picture">
+            <wp:extent cx="5486400" cy="2361235"/>
+            <wp:docPr id="44" name="Picture 44"/>
+            <wp:cNvGraphicFramePr>
+              <a:graphicFrameLocks noChangeAspect="1"/>
+            </wp:cNvGraphicFramePr>
+            <a:graphic>
+              <a:graphicData uri="http://schemas.openxmlformats.org/drawingml/2006/picture">
+                <pic:pic>
+                  <pic:nvPicPr>
+                    <pic:cNvPr id="0" name="specenv_ens_altos_sourdine.png"/>
+                    <pic:cNvPicPr/>
+                  </pic:nvPicPr>
+                  <pic:blipFill>
+                    <a:blip r:embed="rId52"/>
+                    <a:stretch>
+                      <a:fillRect/>
+                    </a:stretch>
+                  </pic:blipFill>
+                  <pic:spPr>
+                    <a:xfrm>
+                      <a:off x="0" y="0"/>
+                      <a:ext cx="5486400" cy="2361235"/>
+                    </a:xfrm>
+                    <a:prstGeom prst="rect"/>
+                  </pic:spPr>
+                </pic:pic>
+              </a:graphicData>
+            </a:graphic>
+          </wp:inline>
+        </w:drawing>
+      </w:r>
+    </w:p>
+    <w:p>
+      <w:pPr>
+        <w:pStyle w:val="Heading2"/>
+      </w:pPr>
+      <w:r>
+        <w:t>Ens. violoncelles</w:t>
+      </w:r>
+    </w:p>
+    <w:p>
+      <w:pPr>
+        <w:jc w:val="center"/>
+      </w:pPr>
+      <w:r>
+        <w:drawing>
+          <wp:inline xmlns:a="http://schemas.openxmlformats.org/drawingml/2006/main" xmlns:pic="http://schemas.openxmlformats.org/drawingml/2006/picture">
+            <wp:extent cx="5486400" cy="2361235"/>
+            <wp:docPr id="45" name="Picture 45"/>
+            <wp:cNvGraphicFramePr>
+              <a:graphicFrameLocks noChangeAspect="1"/>
+            </wp:cNvGraphicFramePr>
+            <a:graphic>
+              <a:graphicData uri="http://schemas.openxmlformats.org/drawingml/2006/picture">
+                <pic:pic>
+                  <pic:nvPicPr>
+                    <pic:cNvPr id="0" name="specenv_ens_violoncelles.png"/>
+                    <pic:cNvPicPr/>
+                  </pic:nvPicPr>
+                  <pic:blipFill>
+                    <a:blip r:embed="rId53"/>
+                    <a:stretch>
+                      <a:fillRect/>
+                    </a:stretch>
+                  </pic:blipFill>
+                  <pic:spPr>
+                    <a:xfrm>
+                      <a:off x="0" y="0"/>
+                      <a:ext cx="5486400" cy="2361235"/>
+                    </a:xfrm>
+                    <a:prstGeom prst="rect"/>
+                  </pic:spPr>
+                </pic:pic>
+              </a:graphicData>
+            </a:graphic>
+          </wp:inline>
+        </w:drawing>
+      </w:r>
+    </w:p>
+    <w:p>
+      <w:pPr>
+        <w:pStyle w:val="Heading2"/>
+      </w:pPr>
+      <w:r>
+        <w:t>Ens. violoncelles+sourdine</w:t>
+      </w:r>
+    </w:p>
+    <w:p>
+      <w:pPr>
+        <w:jc w:val="center"/>
+      </w:pPr>
+      <w:r>
+        <w:drawing>
+          <wp:inline xmlns:a="http://schemas.openxmlformats.org/drawingml/2006/main" xmlns:pic="http://schemas.openxmlformats.org/drawingml/2006/picture">
+            <wp:extent cx="5486400" cy="2361235"/>
+            <wp:docPr id="46" name="Picture 46"/>
+            <wp:cNvGraphicFramePr>
+              <a:graphicFrameLocks noChangeAspect="1"/>
+            </wp:cNvGraphicFramePr>
+            <a:graphic>
+              <a:graphicData uri="http://schemas.openxmlformats.org/drawingml/2006/picture">
+                <pic:pic>
+                  <pic:nvPicPr>
+                    <pic:cNvPr id="0" name="specenv_ens_violoncelles_sourdine.png"/>
+                    <pic:cNvPicPr/>
+                  </pic:nvPicPr>
+                  <pic:blipFill>
+                    <a:blip r:embed="rId54"/>
+                    <a:stretch>
+                      <a:fillRect/>
+                    </a:stretch>
+                  </pic:blipFill>
+                  <pic:spPr>
+                    <a:xfrm>
+                      <a:off x="0" y="0"/>
+                      <a:ext cx="5486400" cy="2361235"/>
+                    </a:xfrm>
+                    <a:prstGeom prst="rect"/>
+                  </pic:spPr>
+                </pic:pic>
+              </a:graphicData>
+            </a:graphic>
+          </wp:inline>
+        </w:drawing>
+      </w:r>
+    </w:p>
+    <w:p>
+      <w:pPr>
+        <w:pStyle w:val="Heading2"/>
+      </w:pPr>
+      <w:r>
+        <w:t>Ens. contrebasses</w:t>
+      </w:r>
+    </w:p>
+    <w:p>
+      <w:pPr>
+        <w:jc w:val="center"/>
+      </w:pPr>
+      <w:r>
+        <w:drawing>
+          <wp:inline xmlns:a="http://schemas.openxmlformats.org/drawingml/2006/main" xmlns:pic="http://schemas.openxmlformats.org/drawingml/2006/picture">
+            <wp:extent cx="5486400" cy="2361235"/>
+            <wp:docPr id="47" name="Picture 47"/>
+            <wp:cNvGraphicFramePr>
+              <a:graphicFrameLocks noChangeAspect="1"/>
+            </wp:cNvGraphicFramePr>
+            <a:graphic>
+              <a:graphicData uri="http://schemas.openxmlformats.org/drawingml/2006/picture">
+                <pic:pic>
+                  <pic:nvPicPr>
+                    <pic:cNvPr id="0" name="specenv_ens_contrebasses.png"/>
+                    <pic:cNvPicPr/>
+                  </pic:nvPicPr>
+                  <pic:blipFill>
+                    <a:blip r:embed="rId55"/>
+                    <a:stretch>
+                      <a:fillRect/>
+                    </a:stretch>
+                  </pic:blipFill>
+                  <pic:spPr>
+                    <a:xfrm>
+                      <a:off x="0" y="0"/>
+                      <a:ext cx="5486400" cy="2361235"/>
+                    </a:xfrm>
+                    <a:prstGeom prst="rect"/>
+                  </pic:spPr>
+                </pic:pic>
+              </a:graphicData>
+            </a:graphic>
+          </wp:inline>
+        </w:drawing>
       </w:r>
     </w:p>
     <w:sectPr>

</xml_diff>